<commit_message>
docs: agregar enlace del repositorio GitHub en portada de evidencias y guion
</commit_message>
<xml_diff>
--- a/Desafio 3.docx
+++ b/Desafio 3.docx
@@ -339,6 +339,61 @@
                 <w:sz w:val="20"/>
               </w:rPr>
               <w:t>Octubre de 2026</w:t>
+            </w:r>
+          </w:p>
+        </w:tc>
+      </w:tr>
+      <w:tr>
+        <w:tc>
+          <w:tcPr>
+            <w:tcW w:type="dxa" w:w="2880"/>
+            <w:shd w:fill="F0F4F8"/>
+            <w:tcMar>
+              <w:top w:w="60" w:type="dxa"/>
+              <w:bottom w:w="60" w:type="dxa"/>
+              <w:left w:w="100" w:type="dxa"/>
+              <w:right w:w="100" w:type="dxa"/>
+            </w:tcMar>
+          </w:tcPr>
+          <w:p>
+            <w:pPr>
+              <w:spacing w:after="40"/>
+            </w:pPr>
+            <w:r>
+              <w:rPr>
+                <w:rFonts w:ascii="Calibri" w:hAnsi="Calibri"/>
+                <w:b/>
+                <w:color w:val="1B365D"/>
+                <w:sz w:val="20"/>
+              </w:rPr>
+              <w:t>Repositorio GitHub:</w:t>
+            </w:r>
+          </w:p>
+        </w:tc>
+        <w:tc>
+          <w:tcPr>
+            <w:tcW w:type="dxa" w:w="5760"/>
+            <w:shd w:fill="FFFFFF"/>
+            <w:tcMar>
+              <w:top w:w="60" w:type="dxa"/>
+              <w:bottom w:w="60" w:type="dxa"/>
+              <w:left w:w="100" w:type="dxa"/>
+              <w:right w:w="100" w:type="dxa"/>
+            </w:tcMar>
+          </w:tcPr>
+          <w:p>
+            <w:pPr>
+              <w:spacing w:after="40"/>
+            </w:pPr>
+            <w:r>
+              <w:rPr>
+                <w:rFonts w:ascii="Calibri" w:hAnsi="Calibri"/>
+                <w:b/>
+                <w:color w:val="0F4C81"/>
+                <w:sz w:val="20"/>
+                <w:u w:val="single"/>
+              </w:rPr>
+              <w:t>https://github.com/kennfir3/Desafio_3</w:t>
             </w:r>
           </w:p>
         </w:tc>

</xml_diff>